<commit_message>
Assignment 3 Pt 2
Finished the Desktop version of The second part of assignment 3, and now need to make an android version of it.
</commit_message>
<xml_diff>
--- a/Callum Wyndham - User Interface Design.docx
+++ b/Callum Wyndham - User Interface Design.docx
@@ -45,19 +45,7 @@
         <w:t>rd</w:t>
       </w:r>
       <w:r>
-        <w:t xml:space="preserve"> person platformer where the player must make their way across </w:t>
-      </w:r>
-      <w:r>
-        <w:t>multiple obstacle courses with</w:t>
-      </w:r>
-      <w:r>
-        <w:t xml:space="preserve"> increasingly difficult.</w:t>
-      </w:r>
-      <w:r>
-        <w:t xml:space="preserve"> The course ends when the player collects the trophy at the end.</w:t>
-      </w:r>
-      <w:r>
-        <w:t xml:space="preserve"> If the player falls, they land on spikes that decrease their health and must make their way back to a checkpoint. If the player loses all their health, they lose the game and must restart from the beginning.</w:t>
+        <w:t xml:space="preserve"> person platformer where the player must make their way across multiple obstacle courses with increasingly difficult. The course ends when the player collects the trophy at the end. If the player falls, they land on spikes that decrease their health and must make their way back to a checkpoint. If the player loses all their health, they lose the game and must restart from the beginning.</w:t>
       </w:r>
     </w:p>
     <w:p/>
@@ -85,10 +73,7 @@
     </w:p>
     <w:p>
       <w:r>
-        <w:t>A simple third-person camera will be implemented, as to make it easier for the player to survey their surroundings and future challenges in the course</w:t>
-      </w:r>
-      <w:r>
-        <w:t>.</w:t>
+        <w:t>A simple third-person camera will be implemented, as to make it easier for the player to survey their surroundings and future challenges in the course.</w:t>
       </w:r>
     </w:p>
     <w:p/>
@@ -209,39 +194,29 @@
           <w:noProof/>
         </w:rPr>
         <w:drawing>
-          <wp:inline distT="0" distB="0" distL="0" distR="0" wp14:anchorId="6DCFDD37" wp14:editId="5B78E5BD">
-            <wp:extent cx="2825578" cy="1590294"/>
+          <wp:inline distT="0" distB="0" distL="0" distR="0" wp14:anchorId="2FBAF220" wp14:editId="31E778D6">
+            <wp:extent cx="2845813" cy="1601681"/>
             <wp:effectExtent l="0" t="0" r="0" b="0"/>
-            <wp:docPr id="1511751641" name="Picture 2" descr="How To Make Intro Splash Screen Unreal Engine"/>
-            <wp:cNvGraphicFramePr>
-              <a:graphicFrameLocks xmlns:a="http://schemas.openxmlformats.org/drawingml/2006/main" noChangeAspect="1"/>
-            </wp:cNvGraphicFramePr>
+            <wp:docPr id="1553732935" name="Picture 2" descr="How To Make Intro Splash Screen Unreal Engine"/>
+            <wp:cNvGraphicFramePr/>
             <a:graphic xmlns:a="http://schemas.openxmlformats.org/drawingml/2006/main">
               <a:graphicData uri="http://schemas.openxmlformats.org/drawingml/2006/picture">
                 <pic:pic xmlns:pic="http://schemas.openxmlformats.org/drawingml/2006/picture">
                   <pic:nvPicPr>
-                    <pic:cNvPr id="0" name="Picture 2" descr="How To Make Intro Splash Screen Unreal Engine"/>
-                    <pic:cNvPicPr>
-                      <a:picLocks noChangeAspect="1" noChangeArrowheads="1"/>
-                    </pic:cNvPicPr>
+                    <pic:cNvPr id="0" name=""/>
+                    <pic:cNvPicPr/>
                   </pic:nvPicPr>
                   <pic:blipFill>
-                    <a:blip r:embed="rId8" cstate="print">
-                      <a:extLst>
-                        <a:ext uri="{28A0092B-C50C-407E-A947-70E740481C1C}">
-                          <a14:useLocalDpi xmlns:a14="http://schemas.microsoft.com/office/drawing/2010/main" val="0"/>
-                        </a:ext>
-                      </a:extLst>
-                    </a:blip>
+                    <a:blip r:embed="rId6"/>
                     <a:srcRect/>
                     <a:stretch>
                       <a:fillRect/>
                     </a:stretch>
                   </pic:blipFill>
-                  <pic:spPr bwMode="auto">
+                  <pic:spPr>
                     <a:xfrm>
                       <a:off x="0" y="0"/>
-                      <a:ext cx="2845810" cy="1601681"/>
+                      <a:ext cx="2845813" cy="1601681"/>
                     </a:xfrm>
                     <a:prstGeom prst="rect">
                       <a:avLst/>
@@ -249,6 +224,7 @@
                     <a:noFill/>
                     <a:ln>
                       <a:noFill/>
+                      <a:prstDash/>
                     </a:ln>
                   </pic:spPr>
                 </pic:pic>
@@ -262,39 +238,29 @@
           <w:noProof/>
         </w:rPr>
         <w:drawing>
-          <wp:inline distT="0" distB="0" distL="0" distR="0" wp14:anchorId="42A28630" wp14:editId="75B92978">
-            <wp:extent cx="2825578" cy="1589291"/>
-            <wp:effectExtent l="0" t="0" r="0" b="0"/>
-            <wp:docPr id="722555036" name="Picture 1"/>
-            <wp:cNvGraphicFramePr>
-              <a:graphicFrameLocks xmlns:a="http://schemas.openxmlformats.org/drawingml/2006/main" noChangeAspect="1"/>
-            </wp:cNvGraphicFramePr>
+          <wp:inline distT="0" distB="0" distL="0" distR="0" wp14:anchorId="181380F6" wp14:editId="3F472154">
+            <wp:extent cx="2862373" cy="1609984"/>
+            <wp:effectExtent l="0" t="0" r="0" b="9266"/>
+            <wp:docPr id="705881906" name="Picture 1"/>
+            <wp:cNvGraphicFramePr/>
             <a:graphic xmlns:a="http://schemas.openxmlformats.org/drawingml/2006/main">
               <a:graphicData uri="http://schemas.openxmlformats.org/drawingml/2006/picture">
                 <pic:pic xmlns:pic="http://schemas.openxmlformats.org/drawingml/2006/picture">
                   <pic:nvPicPr>
-                    <pic:cNvPr id="0" name="Picture 1"/>
-                    <pic:cNvPicPr>
-                      <a:picLocks noChangeAspect="1" noChangeArrowheads="1"/>
-                    </pic:cNvPicPr>
+                    <pic:cNvPr id="0" name=""/>
+                    <pic:cNvPicPr/>
                   </pic:nvPicPr>
                   <pic:blipFill>
-                    <a:blip r:embed="rId9" cstate="print">
-                      <a:extLst>
-                        <a:ext uri="{28A0092B-C50C-407E-A947-70E740481C1C}">
-                          <a14:useLocalDpi xmlns:a14="http://schemas.microsoft.com/office/drawing/2010/main" val="0"/>
-                        </a:ext>
-                      </a:extLst>
-                    </a:blip>
+                    <a:blip r:embed="rId7"/>
                     <a:srcRect/>
                     <a:stretch>
                       <a:fillRect/>
                     </a:stretch>
                   </pic:blipFill>
-                  <pic:spPr bwMode="auto">
+                  <pic:spPr>
                     <a:xfrm>
                       <a:off x="0" y="0"/>
-                      <a:ext cx="2862375" cy="1609988"/>
+                      <a:ext cx="2862373" cy="1609984"/>
                     </a:xfrm>
                     <a:prstGeom prst="rect">
                       <a:avLst/>
@@ -302,6 +268,7 @@
                     <a:noFill/>
                     <a:ln>
                       <a:noFill/>
+                      <a:prstDash/>
                     </a:ln>
                   </pic:spPr>
                 </pic:pic>
@@ -335,39 +302,29 @@
           <w:noProof/>
         </w:rPr>
         <w:drawing>
-          <wp:inline distT="0" distB="0" distL="0" distR="0" wp14:anchorId="7196F066" wp14:editId="1EDDD6F5">
-            <wp:extent cx="4184822" cy="2315210"/>
-            <wp:effectExtent l="0" t="0" r="6350" b="8890"/>
-            <wp:docPr id="518737879" name="Picture 3"/>
-            <wp:cNvGraphicFramePr>
-              <a:graphicFrameLocks xmlns:a="http://schemas.openxmlformats.org/drawingml/2006/main" noChangeAspect="1"/>
-            </wp:cNvGraphicFramePr>
+          <wp:inline distT="0" distB="0" distL="0" distR="0" wp14:anchorId="26D663B1" wp14:editId="09BB3E6B">
+            <wp:extent cx="4214999" cy="2331912"/>
+            <wp:effectExtent l="0" t="0" r="0" b="0"/>
+            <wp:docPr id="444464835" name="Picture 3"/>
+            <wp:cNvGraphicFramePr/>
             <a:graphic xmlns:a="http://schemas.openxmlformats.org/drawingml/2006/main">
               <a:graphicData uri="http://schemas.openxmlformats.org/drawingml/2006/picture">
                 <pic:pic xmlns:pic="http://schemas.openxmlformats.org/drawingml/2006/picture">
                   <pic:nvPicPr>
-                    <pic:cNvPr id="0" name="Picture 4"/>
-                    <pic:cNvPicPr>
-                      <a:picLocks noChangeAspect="1" noChangeArrowheads="1"/>
-                    </pic:cNvPicPr>
+                    <pic:cNvPr id="0" name=""/>
+                    <pic:cNvPicPr/>
                   </pic:nvPicPr>
                   <pic:blipFill>
-                    <a:blip r:embed="rId10" cstate="print">
-                      <a:extLst>
-                        <a:ext uri="{28A0092B-C50C-407E-A947-70E740481C1C}">
-                          <a14:useLocalDpi xmlns:a14="http://schemas.microsoft.com/office/drawing/2010/main" val="0"/>
-                        </a:ext>
-                      </a:extLst>
-                    </a:blip>
+                    <a:blip r:embed="rId8"/>
                     <a:srcRect/>
                     <a:stretch>
                       <a:fillRect/>
                     </a:stretch>
                   </pic:blipFill>
-                  <pic:spPr bwMode="auto">
+                  <pic:spPr>
                     <a:xfrm>
                       <a:off x="0" y="0"/>
-                      <a:ext cx="4215004" cy="2331908"/>
+                      <a:ext cx="4214999" cy="2331912"/>
                     </a:xfrm>
                     <a:prstGeom prst="rect">
                       <a:avLst/>
@@ -375,6 +332,7 @@
                     <a:noFill/>
                     <a:ln>
                       <a:noFill/>
+                      <a:prstDash/>
                     </a:ln>
                   </pic:spPr>
                 </pic:pic>
@@ -399,10 +357,7 @@
         <w:pStyle w:val="Heading2"/>
       </w:pPr>
       <w:r>
-        <w:t>Game</w:t>
-      </w:r>
-      <w:r>
-        <w:t>play</w:t>
+        <w:t>Gameplay</w:t>
       </w:r>
     </w:p>
     <w:p>
@@ -411,22 +366,20 @@
           <w:noProof/>
         </w:rPr>
         <w:drawing>
-          <wp:inline distT="0" distB="0" distL="0" distR="0" wp14:anchorId="3470C9FA" wp14:editId="69A333F3">
-            <wp:extent cx="5943600" cy="2243455"/>
-            <wp:effectExtent l="0" t="0" r="0" b="4445"/>
-            <wp:docPr id="1471111168" name="Picture 1"/>
-            <wp:cNvGraphicFramePr>
-              <a:graphicFrameLocks xmlns:a="http://schemas.openxmlformats.org/drawingml/2006/main" noChangeAspect="1"/>
-            </wp:cNvGraphicFramePr>
+          <wp:inline distT="0" distB="0" distL="0" distR="0" wp14:anchorId="6F563C6D" wp14:editId="5A590C38">
+            <wp:extent cx="5943600" cy="2171699"/>
+            <wp:effectExtent l="0" t="0" r="0" b="1"/>
+            <wp:docPr id="655741085" name="drawing"/>
+            <wp:cNvGraphicFramePr/>
             <a:graphic xmlns:a="http://schemas.openxmlformats.org/drawingml/2006/main">
               <a:graphicData uri="http://schemas.openxmlformats.org/drawingml/2006/picture">
                 <pic:pic xmlns:pic="http://schemas.openxmlformats.org/drawingml/2006/picture">
                   <pic:nvPicPr>
-                    <pic:cNvPr id="1471111168" name=""/>
+                    <pic:cNvPr id="0" name=""/>
                     <pic:cNvPicPr/>
                   </pic:nvPicPr>
                   <pic:blipFill>
-                    <a:blip r:embed="rId11"/>
+                    <a:blip r:embed="rId9"/>
                     <a:stretch>
                       <a:fillRect/>
                     </a:stretch>
@@ -434,11 +387,16 @@
                   <pic:spPr>
                     <a:xfrm>
                       <a:off x="0" y="0"/>
-                      <a:ext cx="5943600" cy="2243455"/>
+                      <a:ext cx="5943600" cy="2171699"/>
                     </a:xfrm>
                     <a:prstGeom prst="rect">
                       <a:avLst/>
                     </a:prstGeom>
+                    <a:noFill/>
+                    <a:ln>
+                      <a:noFill/>
+                      <a:prstDash/>
+                    </a:ln>
                   </pic:spPr>
                 </pic:pic>
               </a:graphicData>
@@ -449,47 +407,19 @@
     </w:p>
     <w:p>
       <w:r>
-        <w:t>Includes a first basic level as well as the player’s health in the top right corner of the screen.</w:t>
-      </w:r>
-      <w:r>
-        <w:t xml:space="preserve"> There is a ladder at the beginning platform so that the player can get back if they fall. When the player reaches a checkpoint, a ladder </w:t>
-      </w:r>
-      <w:r>
-        <w:t>falls</w:t>
-      </w:r>
-      <w:r>
-        <w:t xml:space="preserve"> to the bottom so that the player can get back up at the checkpoint instead of at the beginning.</w:t>
-      </w:r>
-    </w:p>
-    <w:p/>
-    <w:p>
-      <w:pPr>
-        <w:rPr>
-          <w:sz w:val="100"/>
-          <w:szCs w:val="100"/>
-        </w:rPr>
-      </w:pPr>
-      <w:r>
-        <w:rPr>
-          <w:sz w:val="100"/>
-          <w:szCs w:val="100"/>
-        </w:rPr>
-        <w:t>NEED TWO MORE UI ELEMENTS</w:t>
-      </w:r>
-    </w:p>
-    <w:p>
-      <w:pPr>
-        <w:rPr>
-          <w:sz w:val="36"/>
-          <w:szCs w:val="36"/>
-        </w:rPr>
-      </w:pPr>
-      <w:r>
-        <w:rPr>
-          <w:sz w:val="36"/>
-          <w:szCs w:val="36"/>
-        </w:rPr>
-        <w:t>Maybe add like a trophy count and a death counter or something like that.</w:t>
+        <w:t xml:space="preserve">Includes a first basic level as well as the player’s health in the top right corner of the screen. There is a ladder at the beginning platform so that the player can get back if they fall. When the player reaches a checkpoint, a ladder falls to the bottom so that the player can get back up at the checkpoint instead of at the beginning. It also includes a death counter in the top center of the screen </w:t>
+      </w:r>
+      <w:r>
+        <w:t xml:space="preserve">to keep track of how many times you have restarted </w:t>
+      </w:r>
+      <w:r>
+        <w:t>as well as a trophies collected count in the top left</w:t>
+      </w:r>
+      <w:r>
+        <w:t xml:space="preserve"> that shows you how many levels you have completed and resets when you die and go back to the beginning</w:t>
+      </w:r>
+      <w:r>
+        <w:t>.</w:t>
       </w:r>
     </w:p>
     <w:p>
@@ -527,9 +457,12 @@
     </w:p>
     <w:tbl>
       <w:tblPr>
-        <w:tblStyle w:val="TableGrid"/>
-        <w:tblW w:w="0" w:type="auto"/>
-        <w:tblLook w:val="04A0" w:firstRow="1" w:lastRow="0" w:firstColumn="1" w:lastColumn="0" w:noHBand="0" w:noVBand="1"/>
+        <w:tblW w:w="9350" w:type="dxa"/>
+        <w:tblCellMar>
+          <w:left w:w="10" w:type="dxa"/>
+          <w:right w:w="10" w:type="dxa"/>
+        </w:tblCellMar>
+        <w:tblLook w:val="0000" w:firstRow="0" w:lastRow="0" w:firstColumn="0" w:lastColumn="0" w:noHBand="0" w:noVBand="0"/>
       </w:tblPr>
       <w:tblGrid>
         <w:gridCol w:w="895"/>
@@ -539,9 +472,22 @@
         <w:tc>
           <w:tcPr>
             <w:tcW w:w="895" w:type="dxa"/>
+            <w:tcBorders>
+              <w:top w:val="single" w:sz="4" w:space="0" w:color="000000"/>
+              <w:left w:val="single" w:sz="4" w:space="0" w:color="000000"/>
+              <w:bottom w:val="single" w:sz="4" w:space="0" w:color="000000"/>
+              <w:right w:val="single" w:sz="4" w:space="0" w:color="000000"/>
+            </w:tcBorders>
+            <w:tcMar>
+              <w:top w:w="0" w:type="dxa"/>
+              <w:left w:w="108" w:type="dxa"/>
+              <w:bottom w:w="0" w:type="dxa"/>
+              <w:right w:w="108" w:type="dxa"/>
+            </w:tcMar>
           </w:tcPr>
           <w:p>
             <w:pPr>
+              <w:spacing w:after="0"/>
               <w:jc w:val="center"/>
               <w:rPr>
                 <w:b/>
@@ -560,9 +506,22 @@
         <w:tc>
           <w:tcPr>
             <w:tcW w:w="8455" w:type="dxa"/>
+            <w:tcBorders>
+              <w:top w:val="single" w:sz="4" w:space="0" w:color="000000"/>
+              <w:left w:val="single" w:sz="4" w:space="0" w:color="000000"/>
+              <w:bottom w:val="single" w:sz="4" w:space="0" w:color="000000"/>
+              <w:right w:val="single" w:sz="4" w:space="0" w:color="000000"/>
+            </w:tcBorders>
+            <w:tcMar>
+              <w:top w:w="0" w:type="dxa"/>
+              <w:left w:w="108" w:type="dxa"/>
+              <w:bottom w:w="0" w:type="dxa"/>
+              <w:right w:w="108" w:type="dxa"/>
+            </w:tcMar>
           </w:tcPr>
           <w:p>
             <w:pPr>
+              <w:spacing w:after="0"/>
               <w:rPr>
                 <w:b/>
                 <w:bCs/>
@@ -582,10 +541,23 @@
         <w:tc>
           <w:tcPr>
             <w:tcW w:w="895" w:type="dxa"/>
+            <w:tcBorders>
+              <w:top w:val="single" w:sz="4" w:space="0" w:color="000000"/>
+              <w:left w:val="single" w:sz="4" w:space="0" w:color="000000"/>
+              <w:bottom w:val="single" w:sz="4" w:space="0" w:color="000000"/>
+              <w:right w:val="single" w:sz="4" w:space="0" w:color="000000"/>
+            </w:tcBorders>
+            <w:tcMar>
+              <w:top w:w="0" w:type="dxa"/>
+              <w:left w:w="108" w:type="dxa"/>
+              <w:bottom w:w="0" w:type="dxa"/>
+              <w:right w:w="108" w:type="dxa"/>
+            </w:tcMar>
             <w:vAlign w:val="center"/>
           </w:tcPr>
           <w:p>
             <w:pPr>
+              <w:spacing w:after="0"/>
               <w:jc w:val="center"/>
             </w:pPr>
             <w:r>
@@ -596,19 +568,55 @@
         <w:tc>
           <w:tcPr>
             <w:tcW w:w="8455" w:type="dxa"/>
+            <w:tcBorders>
+              <w:top w:val="single" w:sz="4" w:space="0" w:color="000000"/>
+              <w:left w:val="single" w:sz="4" w:space="0" w:color="000000"/>
+              <w:bottom w:val="single" w:sz="4" w:space="0" w:color="000000"/>
+              <w:right w:val="single" w:sz="4" w:space="0" w:color="000000"/>
+            </w:tcBorders>
+            <w:tcMar>
+              <w:top w:w="0" w:type="dxa"/>
+              <w:left w:w="108" w:type="dxa"/>
+              <w:bottom w:w="0" w:type="dxa"/>
+              <w:right w:w="108" w:type="dxa"/>
+            </w:tcMar>
           </w:tcPr>
-          <w:p/>
-          <w:p/>
+          <w:p>
+            <w:pPr>
+              <w:spacing w:after="0"/>
+            </w:pPr>
+            <w:r>
+              <w:t>First Level, Health Mechanics, Spike Functionality</w:t>
+            </w:r>
+          </w:p>
+          <w:p>
+            <w:pPr>
+              <w:spacing w:after="0"/>
+            </w:pPr>
+          </w:p>
         </w:tc>
       </w:tr>
       <w:tr>
         <w:tc>
           <w:tcPr>
             <w:tcW w:w="895" w:type="dxa"/>
+            <w:tcBorders>
+              <w:top w:val="single" w:sz="4" w:space="0" w:color="000000"/>
+              <w:left w:val="single" w:sz="4" w:space="0" w:color="000000"/>
+              <w:bottom w:val="single" w:sz="4" w:space="0" w:color="000000"/>
+              <w:right w:val="single" w:sz="4" w:space="0" w:color="000000"/>
+            </w:tcBorders>
+            <w:tcMar>
+              <w:top w:w="0" w:type="dxa"/>
+              <w:left w:w="108" w:type="dxa"/>
+              <w:bottom w:w="0" w:type="dxa"/>
+              <w:right w:w="108" w:type="dxa"/>
+            </w:tcMar>
             <w:vAlign w:val="center"/>
           </w:tcPr>
           <w:p>
             <w:pPr>
+              <w:spacing w:after="0"/>
               <w:jc w:val="center"/>
             </w:pPr>
             <w:r>
@@ -619,9 +627,32 @@
         <w:tc>
           <w:tcPr>
             <w:tcW w:w="8455" w:type="dxa"/>
+            <w:tcBorders>
+              <w:top w:val="single" w:sz="4" w:space="0" w:color="000000"/>
+              <w:left w:val="single" w:sz="4" w:space="0" w:color="000000"/>
+              <w:bottom w:val="single" w:sz="4" w:space="0" w:color="000000"/>
+              <w:right w:val="single" w:sz="4" w:space="0" w:color="000000"/>
+            </w:tcBorders>
+            <w:tcMar>
+              <w:top w:w="0" w:type="dxa"/>
+              <w:left w:w="108" w:type="dxa"/>
+              <w:bottom w:w="0" w:type="dxa"/>
+              <w:right w:w="108" w:type="dxa"/>
+            </w:tcMar>
           </w:tcPr>
-          <w:p/>
-          <w:p/>
+          <w:p>
+            <w:pPr>
+              <w:spacing w:after="0"/>
+            </w:pPr>
+            <w:r>
+              <w:t>Death Counter, Trophy Counter with Trophy Actor</w:t>
+            </w:r>
+          </w:p>
+          <w:p>
+            <w:pPr>
+              <w:spacing w:after="0"/>
+            </w:pPr>
+          </w:p>
         </w:tc>
       </w:tr>
     </w:tbl>
@@ -630,7 +661,6 @@
         <w:pStyle w:val="Heading1"/>
       </w:pPr>
       <w:r>
-        <w:lastRenderedPageBreak/>
         <w:t>Credits</w:t>
       </w:r>
     </w:p>
@@ -639,12 +669,159 @@
         <w:t>Callum Wyndham – Lead Programmer</w:t>
       </w:r>
     </w:p>
-    <w:p/>
+    <w:p>
+      <w:pPr>
+        <w:pStyle w:val="Heading1"/>
+      </w:pPr>
+    </w:p>
+    <w:p>
+      <w:pPr>
+        <w:pageBreakBefore/>
+      </w:pPr>
+    </w:p>
+    <w:p>
+      <w:pPr>
+        <w:pStyle w:val="Heading1"/>
+      </w:pPr>
+      <w:r>
+        <w:t>Flowcharts</w:t>
+      </w:r>
+    </w:p>
+    <w:p>
+      <w:r>
+        <w:t>Health Flowchart:</w:t>
+      </w:r>
+    </w:p>
+    <w:p>
+      <w:r>
+        <w:rPr>
+          <w:noProof/>
+        </w:rPr>
+        <w:drawing>
+          <wp:inline distT="0" distB="0" distL="0" distR="0" wp14:anchorId="2536AC78" wp14:editId="3D832F31">
+            <wp:extent cx="5943600" cy="2495553"/>
+            <wp:effectExtent l="0" t="0" r="0" b="0"/>
+            <wp:docPr id="654152608" name="drawing"/>
+            <wp:cNvGraphicFramePr/>
+            <a:graphic xmlns:a="http://schemas.openxmlformats.org/drawingml/2006/main">
+              <a:graphicData uri="http://schemas.openxmlformats.org/drawingml/2006/picture">
+                <pic:pic xmlns:pic="http://schemas.openxmlformats.org/drawingml/2006/picture">
+                  <pic:nvPicPr>
+                    <pic:cNvPr id="0" name=""/>
+                    <pic:cNvPicPr/>
+                  </pic:nvPicPr>
+                  <pic:blipFill>
+                    <a:blip r:embed="rId10"/>
+                    <a:stretch>
+                      <a:fillRect/>
+                    </a:stretch>
+                  </pic:blipFill>
+                  <pic:spPr>
+                    <a:xfrm>
+                      <a:off x="0" y="0"/>
+                      <a:ext cx="5943600" cy="2495553"/>
+                    </a:xfrm>
+                    <a:prstGeom prst="rect">
+                      <a:avLst/>
+                    </a:prstGeom>
+                    <a:noFill/>
+                    <a:ln>
+                      <a:noFill/>
+                      <a:prstDash/>
+                    </a:ln>
+                  </pic:spPr>
+                </pic:pic>
+              </a:graphicData>
+            </a:graphic>
+          </wp:inline>
+        </w:drawing>
+      </w:r>
+      <w:r>
+        <w:t>Trophy Flowchart:</w:t>
+      </w:r>
+    </w:p>
+    <w:p>
+      <w:r>
+        <w:rPr>
+          <w:noProof/>
+        </w:rPr>
+        <w:drawing>
+          <wp:inline distT="0" distB="0" distL="0" distR="0" wp14:anchorId="6CB63C18" wp14:editId="262C67FF">
+            <wp:extent cx="5943600" cy="2667003"/>
+            <wp:effectExtent l="0" t="0" r="0" b="0"/>
+            <wp:docPr id="1273153759" name="drawing"/>
+            <wp:cNvGraphicFramePr/>
+            <a:graphic xmlns:a="http://schemas.openxmlformats.org/drawingml/2006/main">
+              <a:graphicData uri="http://schemas.openxmlformats.org/drawingml/2006/picture">
+                <pic:pic xmlns:pic="http://schemas.openxmlformats.org/drawingml/2006/picture">
+                  <pic:nvPicPr>
+                    <pic:cNvPr id="0" name=""/>
+                    <pic:cNvPicPr/>
+                  </pic:nvPicPr>
+                  <pic:blipFill>
+                    <a:blip r:embed="rId11"/>
+                    <a:stretch>
+                      <a:fillRect/>
+                    </a:stretch>
+                  </pic:blipFill>
+                  <pic:spPr>
+                    <a:xfrm>
+                      <a:off x="0" y="0"/>
+                      <a:ext cx="5943600" cy="2667003"/>
+                    </a:xfrm>
+                    <a:prstGeom prst="rect">
+                      <a:avLst/>
+                    </a:prstGeom>
+                    <a:noFill/>
+                    <a:ln>
+                      <a:noFill/>
+                      <a:prstDash/>
+                    </a:ln>
+                  </pic:spPr>
+                </pic:pic>
+              </a:graphicData>
+            </a:graphic>
+          </wp:inline>
+        </w:drawing>
+      </w:r>
+    </w:p>
+    <w:p>
+      <w:pPr>
+        <w:pStyle w:val="Heading1"/>
+      </w:pPr>
+      <w:r>
+        <w:t>Pseudocode</w:t>
+      </w:r>
+    </w:p>
+    <w:p>
+      <w:r>
+        <w:t>Death Counter Pseudocode:</w:t>
+      </w:r>
+    </w:p>
+    <w:p>
+      <w:r>
+        <w:t>BEGIN</w:t>
+      </w:r>
+    </w:p>
+    <w:p>
+      <w:r>
+        <w:t>GET current death count FROM HUD</w:t>
+      </w:r>
+    </w:p>
+    <w:p>
+      <w:r>
+        <w:t>SET current death count = current death count + 1</w:t>
+      </w:r>
+    </w:p>
+    <w:p>
+      <w:r>
+        <w:t>END</w:t>
+      </w:r>
+    </w:p>
     <w:sectPr>
       <w:pgSz w:w="12240" w:h="15840"/>
       <w:pgMar w:top="1440" w:right="1440" w:bottom="1440" w:left="1440" w:header="720" w:footer="720" w:gutter="0"/>
       <w:cols w:space="720"/>
-      <w:docGrid w:linePitch="360"/>
     </w:sectPr>
   </w:body>
 </w:document>
@@ -683,6 +860,9 @@
         <w:spacing w:after="0" w:line="240" w:lineRule="auto"/>
       </w:pPr>
       <w:r>
+        <w:rPr>
+          <w:color w:val="000000"/>
+        </w:rPr>
         <w:separator/>
       </w:r>
     </w:p>
@@ -698,126 +878,6 @@
     </w:p>
   </w:footnote>
 </w:footnotes>
-</file>
-
-<file path=word/numbering.xml><?xml version="1.0" encoding="utf-8"?>
-<w:numbering xmlns:wpc="http://schemas.microsoft.com/office/word/2010/wordprocessingCanvas" xmlns:cx="http://schemas.microsoft.com/office/drawing/2014/chartex" xmlns:cx1="http://schemas.microsoft.com/office/drawing/2015/9/8/chartex" xmlns:cx2="http://schemas.microsoft.com/office/drawing/2015/10/21/chartex" xmlns:cx3="http://schemas.microsoft.com/office/drawing/2016/5/9/chartex" xmlns:cx4="http://schemas.microsoft.com/office/drawing/2016/5/10/chartex" xmlns:cx5="http://schemas.microsoft.com/office/drawing/2016/5/11/chartex" xmlns:cx6="http://schemas.microsoft.com/office/drawing/2016/5/12/chartex" xmlns:cx7="http://schemas.microsoft.com/office/drawing/2016/5/13/chartex" xmlns:cx8="http://schemas.microsoft.com/office/drawing/2016/5/14/chartex" xmlns:mc="http://schemas.openxmlformats.org/markup-compatibility/2006" xmlns:aink="http://schemas.microsoft.com/office/drawing/2016/ink" xmlns:am3d="http://schemas.microsoft.com/office/drawing/2017/model3d" xmlns:o="urn:schemas-microsoft-com:office:office" xmlns:oel="http://schemas.microsoft.com/office/2019/extlst" xmlns:r="http://schemas.openxmlformats.org/officeDocument/2006/relationships" xmlns:m="http://schemas.openxmlformats.org/officeDocument/2006/math" xmlns:v="urn:schemas-microsoft-com:vml" xmlns:wp14="http://schemas.microsoft.com/office/word/2010/wordprocessingDrawing" xmlns:wp="http://schemas.openxmlformats.org/drawingml/2006/wordprocessingDrawing" xmlns:w10="urn:schemas-microsoft-com:office:word" xmlns:w="http://schemas.openxmlformats.org/wordprocessingml/2006/main" xmlns:w14="http://schemas.microsoft.com/office/word/2010/wordml" xmlns:w15="http://schemas.microsoft.com/office/word/2012/wordml" xmlns:w16cex="http://schemas.microsoft.com/office/word/2018/wordml/cex" xmlns:w16cid="http://schemas.microsoft.com/office/word/2016/wordml/cid" xmlns:w16="http://schemas.microsoft.com/office/word/2018/wordml" xmlns:w16du="http://schemas.microsoft.com/office/word/2023/wordml/word16du" xmlns:w16sdtdh="http://schemas.microsoft.com/office/word/2020/wordml/sdtdatahash" xmlns:w16sdtfl="http://schemas.microsoft.com/office/word/2024/wordml/sdtformatlock" xmlns:w16se="http://schemas.microsoft.com/office/word/2015/wordml/symex" xmlns:wpg="http://schemas.microsoft.com/office/word/2010/wordprocessingGroup" xmlns:wpi="http://schemas.microsoft.com/office/word/2010/wordprocessingInk" xmlns:wne="http://schemas.microsoft.com/office/word/2006/wordml" xmlns:wps="http://schemas.microsoft.com/office/word/2010/wordprocessingShape" mc:Ignorable="w14 w15 w16se w16cid w16 w16cex w16sdtdh w16sdtfl w16du wp14">
-  <w:abstractNum w:abstractNumId="0" w15:restartNumberingAfterBreak="0">
-    <w:nsid w:val="743A276E"/>
-    <w:multiLevelType w:val="hybridMultilevel"/>
-    <w:tmpl w:val="D16E1284"/>
-    <w:lvl w:ilvl="0" w:tplc="1FB482F0">
-      <w:numFmt w:val="bullet"/>
-      <w:lvlText w:val="-"/>
-      <w:lvlJc w:val="left"/>
-      <w:pPr>
-        <w:ind w:left="720" w:hanging="360"/>
-      </w:pPr>
-      <w:rPr>
-        <w:rFonts w:ascii="Calibri" w:eastAsiaTheme="minorHAnsi" w:hAnsi="Calibri" w:cs="Calibri" w:hint="default"/>
-      </w:rPr>
-    </w:lvl>
-    <w:lvl w:ilvl="1" w:tplc="04090003">
-      <w:start w:val="1"/>
-      <w:numFmt w:val="bullet"/>
-      <w:lvlText w:val="o"/>
-      <w:lvlJc w:val="left"/>
-      <w:pPr>
-        <w:ind w:left="1440" w:hanging="360"/>
-      </w:pPr>
-      <w:rPr>
-        <w:rFonts w:ascii="Courier New" w:hAnsi="Courier New" w:cs="Courier New" w:hint="default"/>
-      </w:rPr>
-    </w:lvl>
-    <w:lvl w:ilvl="2" w:tplc="04090005">
-      <w:start w:val="1"/>
-      <w:numFmt w:val="bullet"/>
-      <w:lvlText w:val=""/>
-      <w:lvlJc w:val="left"/>
-      <w:pPr>
-        <w:ind w:left="2160" w:hanging="360"/>
-      </w:pPr>
-      <w:rPr>
-        <w:rFonts w:ascii="Wingdings" w:hAnsi="Wingdings" w:hint="default"/>
-      </w:rPr>
-    </w:lvl>
-    <w:lvl w:ilvl="3" w:tplc="04090001">
-      <w:start w:val="1"/>
-      <w:numFmt w:val="bullet"/>
-      <w:lvlText w:val=""/>
-      <w:lvlJc w:val="left"/>
-      <w:pPr>
-        <w:ind w:left="2880" w:hanging="360"/>
-      </w:pPr>
-      <w:rPr>
-        <w:rFonts w:ascii="Symbol" w:hAnsi="Symbol" w:hint="default"/>
-      </w:rPr>
-    </w:lvl>
-    <w:lvl w:ilvl="4" w:tplc="04090003">
-      <w:start w:val="1"/>
-      <w:numFmt w:val="bullet"/>
-      <w:lvlText w:val="o"/>
-      <w:lvlJc w:val="left"/>
-      <w:pPr>
-        <w:ind w:left="3600" w:hanging="360"/>
-      </w:pPr>
-      <w:rPr>
-        <w:rFonts w:ascii="Courier New" w:hAnsi="Courier New" w:cs="Courier New" w:hint="default"/>
-      </w:rPr>
-    </w:lvl>
-    <w:lvl w:ilvl="5" w:tplc="04090005">
-      <w:start w:val="1"/>
-      <w:numFmt w:val="bullet"/>
-      <w:lvlText w:val=""/>
-      <w:lvlJc w:val="left"/>
-      <w:pPr>
-        <w:ind w:left="4320" w:hanging="360"/>
-      </w:pPr>
-      <w:rPr>
-        <w:rFonts w:ascii="Wingdings" w:hAnsi="Wingdings" w:hint="default"/>
-      </w:rPr>
-    </w:lvl>
-    <w:lvl w:ilvl="6" w:tplc="04090001">
-      <w:start w:val="1"/>
-      <w:numFmt w:val="bullet"/>
-      <w:lvlText w:val=""/>
-      <w:lvlJc w:val="left"/>
-      <w:pPr>
-        <w:ind w:left="5040" w:hanging="360"/>
-      </w:pPr>
-      <w:rPr>
-        <w:rFonts w:ascii="Symbol" w:hAnsi="Symbol" w:hint="default"/>
-      </w:rPr>
-    </w:lvl>
-    <w:lvl w:ilvl="7" w:tplc="04090003">
-      <w:start w:val="1"/>
-      <w:numFmt w:val="bullet"/>
-      <w:lvlText w:val="o"/>
-      <w:lvlJc w:val="left"/>
-      <w:pPr>
-        <w:ind w:left="5760" w:hanging="360"/>
-      </w:pPr>
-      <w:rPr>
-        <w:rFonts w:ascii="Courier New" w:hAnsi="Courier New" w:cs="Courier New" w:hint="default"/>
-      </w:rPr>
-    </w:lvl>
-    <w:lvl w:ilvl="8" w:tplc="04090005">
-      <w:start w:val="1"/>
-      <w:numFmt w:val="bullet"/>
-      <w:lvlText w:val=""/>
-      <w:lvlJc w:val="left"/>
-      <w:pPr>
-        <w:ind w:left="6480" w:hanging="360"/>
-      </w:pPr>
-      <w:rPr>
-        <w:rFonts w:ascii="Wingdings" w:hAnsi="Wingdings" w:hint="default"/>
-      </w:rPr>
-    </w:lvl>
-  </w:abstractNum>
-  <w:num w:numId="1" w16cid:durableId="274675486">
-    <w:abstractNumId w:val="0"/>
-  </w:num>
-</w:numbering>
 </file>
 
 <file path=word/styles.xml><?xml version="1.0" encoding="utf-8"?>
@@ -825,7 +885,7 @@
   <w:docDefaults>
     <w:rPrDefault>
       <w:rPr>
-        <w:rFonts w:asciiTheme="minorHAnsi" w:eastAsiaTheme="minorHAnsi" w:hAnsiTheme="minorHAnsi" w:cstheme="minorBidi"/>
+        <w:rFonts w:ascii="Calibri" w:eastAsia="Calibri" w:hAnsi="Calibri" w:cs="Arial"/>
         <w:sz w:val="22"/>
         <w:szCs w:val="22"/>
         <w:lang w:val="en-US" w:eastAsia="en-US" w:bidi="ar-SA"/>
@@ -833,7 +893,9 @@
     </w:rPrDefault>
     <w:pPrDefault>
       <w:pPr>
-        <w:spacing w:after="160" w:line="259" w:lineRule="auto"/>
+        <w:autoSpaceDN w:val="0"/>
+        <w:spacing w:after="160" w:line="256" w:lineRule="auto"/>
+        <w:textAlignment w:val="baseline"/>
       </w:pPr>
     </w:pPrDefault>
   </w:docDefaults>
@@ -1218,19 +1280,17 @@
   <w:style w:type="paragraph" w:default="1" w:styleId="Normal">
     <w:name w:val="Normal"/>
     <w:qFormat/>
-    <w:rsid w:val="006E38C2"/>
     <w:pPr>
-      <w:spacing w:line="256" w:lineRule="auto"/>
+      <w:suppressAutoHyphens/>
+      <w:spacing w:line="254" w:lineRule="auto"/>
     </w:pPr>
   </w:style>
   <w:style w:type="paragraph" w:styleId="Heading1">
     <w:name w:val="heading 1"/>
     <w:basedOn w:val="Normal"/>
     <w:next w:val="Normal"/>
-    <w:link w:val="Heading1Char"/>
     <w:uiPriority w:val="9"/>
     <w:qFormat/>
-    <w:rsid w:val="006E38C2"/>
     <w:pPr>
       <w:keepNext/>
       <w:keepLines/>
@@ -1238,8 +1298,8 @@
       <w:outlineLvl w:val="0"/>
     </w:pPr>
     <w:rPr>
-      <w:rFonts w:asciiTheme="majorHAnsi" w:eastAsiaTheme="majorEastAsia" w:hAnsiTheme="majorHAnsi" w:cstheme="majorBidi"/>
-      <w:color w:val="2F5496" w:themeColor="accent1" w:themeShade="BF"/>
+      <w:rFonts w:ascii="Calibri Light" w:eastAsia="Yu Gothic Light" w:hAnsi="Calibri Light" w:cs="Times New Roman"/>
+      <w:color w:val="2F5496"/>
       <w:sz w:val="32"/>
       <w:szCs w:val="32"/>
     </w:rPr>
@@ -1248,11 +1308,9 @@
     <w:name w:val="heading 2"/>
     <w:basedOn w:val="Normal"/>
     <w:next w:val="Normal"/>
-    <w:link w:val="Heading2Char"/>
     <w:uiPriority w:val="9"/>
     <w:unhideWhenUsed/>
     <w:qFormat/>
-    <w:rsid w:val="006E38C2"/>
     <w:pPr>
       <w:keepNext/>
       <w:keepLines/>
@@ -1260,8 +1318,8 @@
       <w:outlineLvl w:val="1"/>
     </w:pPr>
     <w:rPr>
-      <w:rFonts w:asciiTheme="majorHAnsi" w:eastAsiaTheme="majorEastAsia" w:hAnsiTheme="majorHAnsi" w:cstheme="majorBidi"/>
-      <w:color w:val="2F5496" w:themeColor="accent1" w:themeShade="BF"/>
+      <w:rFonts w:ascii="Calibri Light" w:eastAsia="Yu Gothic Light" w:hAnsi="Calibri Light" w:cs="Times New Roman"/>
+      <w:color w:val="2F5496"/>
       <w:sz w:val="26"/>
       <w:szCs w:val="26"/>
     </w:rPr>
@@ -1270,12 +1328,10 @@
     <w:name w:val="heading 3"/>
     <w:basedOn w:val="Normal"/>
     <w:next w:val="Normal"/>
-    <w:link w:val="Heading3Char"/>
     <w:uiPriority w:val="9"/>
     <w:semiHidden/>
     <w:unhideWhenUsed/>
     <w:qFormat/>
-    <w:rsid w:val="006E38C2"/>
     <w:pPr>
       <w:keepNext/>
       <w:keepLines/>
@@ -1283,8 +1339,8 @@
       <w:outlineLvl w:val="2"/>
     </w:pPr>
     <w:rPr>
-      <w:rFonts w:asciiTheme="majorHAnsi" w:eastAsiaTheme="majorEastAsia" w:hAnsiTheme="majorHAnsi" w:cstheme="majorBidi"/>
-      <w:color w:val="1F3763" w:themeColor="accent1" w:themeShade="7F"/>
+      <w:rFonts w:ascii="Calibri Light" w:eastAsia="Yu Gothic Light" w:hAnsi="Calibri Light" w:cs="Times New Roman"/>
+      <w:color w:val="1F3763"/>
       <w:sz w:val="24"/>
       <w:szCs w:val="24"/>
     </w:rPr>
@@ -1320,18 +1376,15 @@
     <w:name w:val="Title"/>
     <w:basedOn w:val="Normal"/>
     <w:next w:val="Normal"/>
-    <w:link w:val="TitleChar"/>
     <w:uiPriority w:val="10"/>
     <w:qFormat/>
-    <w:rsid w:val="006E38C2"/>
     <w:pPr>
       <w:spacing w:after="0" w:line="240" w:lineRule="auto"/>
-      <w:contextualSpacing/>
     </w:pPr>
     <w:rPr>
-      <w:rFonts w:asciiTheme="majorHAnsi" w:eastAsiaTheme="majorEastAsia" w:hAnsiTheme="majorHAnsi" w:cstheme="majorBidi"/>
+      <w:rFonts w:ascii="Calibri Light" w:eastAsia="Yu Gothic Light" w:hAnsi="Calibri Light" w:cs="Times New Roman"/>
       <w:spacing w:val="-10"/>
-      <w:kern w:val="28"/>
+      <w:kern w:val="3"/>
       <w:sz w:val="56"/>
       <w:szCs w:val="56"/>
     </w:rPr>
@@ -1339,13 +1392,10 @@
   <w:style w:type="character" w:customStyle="1" w:styleId="TitleChar">
     <w:name w:val="Title Char"/>
     <w:basedOn w:val="DefaultParagraphFont"/>
-    <w:link w:val="Title"/>
-    <w:uiPriority w:val="10"/>
-    <w:rsid w:val="006E38C2"/>
     <w:rPr>
-      <w:rFonts w:asciiTheme="majorHAnsi" w:eastAsiaTheme="majorEastAsia" w:hAnsiTheme="majorHAnsi" w:cstheme="majorBidi"/>
+      <w:rFonts w:ascii="Calibri Light" w:eastAsia="Yu Gothic Light" w:hAnsi="Calibri Light" w:cs="Times New Roman"/>
       <w:spacing w:val="-10"/>
-      <w:kern w:val="28"/>
+      <w:kern w:val="3"/>
       <w:sz w:val="56"/>
       <w:szCs w:val="56"/>
     </w:rPr>
@@ -1354,42 +1404,29 @@
     <w:name w:val="Subtitle"/>
     <w:basedOn w:val="Normal"/>
     <w:next w:val="Normal"/>
-    <w:link w:val="SubtitleChar"/>
     <w:uiPriority w:val="11"/>
     <w:qFormat/>
-    <w:rsid w:val="006E38C2"/>
-    <w:pPr>
-      <w:numPr>
-        <w:ilvl w:val="1"/>
-      </w:numPr>
-    </w:pPr>
     <w:rPr>
-      <w:rFonts w:eastAsiaTheme="minorEastAsia"/>
-      <w:color w:val="5A5A5A" w:themeColor="text1" w:themeTint="A5"/>
+      <w:rFonts w:eastAsia="Yu Mincho"/>
+      <w:color w:val="5A5A5A"/>
       <w:spacing w:val="15"/>
     </w:rPr>
   </w:style>
   <w:style w:type="character" w:customStyle="1" w:styleId="SubtitleChar">
     <w:name w:val="Subtitle Char"/>
     <w:basedOn w:val="DefaultParagraphFont"/>
-    <w:link w:val="Subtitle"/>
-    <w:uiPriority w:val="11"/>
-    <w:rsid w:val="006E38C2"/>
     <w:rPr>
-      <w:rFonts w:eastAsiaTheme="minorEastAsia"/>
-      <w:color w:val="5A5A5A" w:themeColor="text1" w:themeTint="A5"/>
+      <w:rFonts w:eastAsia="Yu Mincho"/>
+      <w:color w:val="5A5A5A"/>
       <w:spacing w:val="15"/>
     </w:rPr>
   </w:style>
   <w:style w:type="character" w:customStyle="1" w:styleId="Heading1Char">
     <w:name w:val="Heading 1 Char"/>
     <w:basedOn w:val="DefaultParagraphFont"/>
-    <w:link w:val="Heading1"/>
-    <w:uiPriority w:val="9"/>
-    <w:rsid w:val="006E38C2"/>
     <w:rPr>
-      <w:rFonts w:asciiTheme="majorHAnsi" w:eastAsiaTheme="majorEastAsia" w:hAnsiTheme="majorHAnsi" w:cstheme="majorBidi"/>
-      <w:color w:val="2F5496" w:themeColor="accent1" w:themeShade="BF"/>
+      <w:rFonts w:ascii="Calibri Light" w:eastAsia="Yu Gothic Light" w:hAnsi="Calibri Light" w:cs="Times New Roman"/>
+      <w:color w:val="2F5496"/>
       <w:sz w:val="32"/>
       <w:szCs w:val="32"/>
     </w:rPr>
@@ -1397,12 +1434,9 @@
   <w:style w:type="character" w:customStyle="1" w:styleId="Heading2Char">
     <w:name w:val="Heading 2 Char"/>
     <w:basedOn w:val="DefaultParagraphFont"/>
-    <w:link w:val="Heading2"/>
-    <w:uiPriority w:val="9"/>
-    <w:rsid w:val="006E38C2"/>
     <w:rPr>
-      <w:rFonts w:asciiTheme="majorHAnsi" w:eastAsiaTheme="majorEastAsia" w:hAnsiTheme="majorHAnsi" w:cstheme="majorBidi"/>
-      <w:color w:val="2F5496" w:themeColor="accent1" w:themeShade="BF"/>
+      <w:rFonts w:ascii="Calibri Light" w:eastAsia="Yu Gothic Light" w:hAnsi="Calibri Light" w:cs="Times New Roman"/>
+      <w:color w:val="2F5496"/>
       <w:sz w:val="26"/>
       <w:szCs w:val="26"/>
     </w:rPr>
@@ -1410,13 +1444,9 @@
   <w:style w:type="character" w:customStyle="1" w:styleId="Heading3Char">
     <w:name w:val="Heading 3 Char"/>
     <w:basedOn w:val="DefaultParagraphFont"/>
-    <w:link w:val="Heading3"/>
-    <w:uiPriority w:val="9"/>
-    <w:semiHidden/>
-    <w:rsid w:val="006E38C2"/>
     <w:rPr>
-      <w:rFonts w:asciiTheme="majorHAnsi" w:eastAsiaTheme="majorEastAsia" w:hAnsiTheme="majorHAnsi" w:cstheme="majorBidi"/>
-      <w:color w:val="1F3763" w:themeColor="accent1" w:themeShade="7F"/>
+      <w:rFonts w:ascii="Calibri Light" w:eastAsia="Yu Gothic Light" w:hAnsi="Calibri Light" w:cs="Times New Roman"/>
+      <w:color w:val="1F3763"/>
       <w:sz w:val="24"/>
       <w:szCs w:val="24"/>
     </w:rPr>
@@ -1424,21 +1454,13 @@
   <w:style w:type="paragraph" w:styleId="ListParagraph">
     <w:name w:val="List Paragraph"/>
     <w:basedOn w:val="Normal"/>
-    <w:uiPriority w:val="34"/>
-    <w:qFormat/>
-    <w:rsid w:val="006E38C2"/>
     <w:pPr>
       <w:ind w:left="720"/>
-      <w:contextualSpacing/>
     </w:pPr>
   </w:style>
   <w:style w:type="paragraph" w:styleId="Header">
     <w:name w:val="header"/>
     <w:basedOn w:val="Normal"/>
-    <w:link w:val="HeaderChar"/>
-    <w:uiPriority w:val="99"/>
-    <w:unhideWhenUsed/>
-    <w:rsid w:val="006E38C2"/>
     <w:pPr>
       <w:tabs>
         <w:tab w:val="center" w:pos="4680"/>
@@ -1450,17 +1472,10 @@
   <w:style w:type="character" w:customStyle="1" w:styleId="HeaderChar">
     <w:name w:val="Header Char"/>
     <w:basedOn w:val="DefaultParagraphFont"/>
-    <w:link w:val="Header"/>
-    <w:uiPriority w:val="99"/>
-    <w:rsid w:val="006E38C2"/>
   </w:style>
   <w:style w:type="paragraph" w:styleId="Footer">
     <w:name w:val="footer"/>
     <w:basedOn w:val="Normal"/>
-    <w:link w:val="FooterChar"/>
-    <w:uiPriority w:val="99"/>
-    <w:unhideWhenUsed/>
-    <w:rsid w:val="006E38C2"/>
     <w:pPr>
       <w:tabs>
         <w:tab w:val="center" w:pos="4680"/>
@@ -1472,28 +1487,6 @@
   <w:style w:type="character" w:customStyle="1" w:styleId="FooterChar">
     <w:name w:val="Footer Char"/>
     <w:basedOn w:val="DefaultParagraphFont"/>
-    <w:link w:val="Footer"/>
-    <w:uiPriority w:val="99"/>
-    <w:rsid w:val="006E38C2"/>
-  </w:style>
-  <w:style w:type="table" w:styleId="TableGrid">
-    <w:name w:val="Table Grid"/>
-    <w:basedOn w:val="TableNormal"/>
-    <w:uiPriority w:val="39"/>
-    <w:rsid w:val="006E38C2"/>
-    <w:pPr>
-      <w:spacing w:after="0" w:line="240" w:lineRule="auto"/>
-    </w:pPr>
-    <w:tblPr>
-      <w:tblBorders>
-        <w:top w:val="single" w:sz="4" w:space="0" w:color="auto"/>
-        <w:left w:val="single" w:sz="4" w:space="0" w:color="auto"/>
-        <w:bottom w:val="single" w:sz="4" w:space="0" w:color="auto"/>
-        <w:right w:val="single" w:sz="4" w:space="0" w:color="auto"/>
-        <w:insideH w:val="single" w:sz="4" w:space="0" w:color="auto"/>
-        <w:insideV w:val="single" w:sz="4" w:space="0" w:color="auto"/>
-      </w:tblBorders>
-    </w:tblPr>
   </w:style>
 </w:styles>
 </file>
@@ -1509,39 +1502,39 @@
         <a:sysClr val="window" lastClr="FFFFFF"/>
       </a:lt1>
       <a:dk2>
-        <a:srgbClr val="44546A"/>
+        <a:srgbClr val="0E2841"/>
       </a:dk2>
       <a:lt2>
-        <a:srgbClr val="E7E6E6"/>
+        <a:srgbClr val="E8E8E8"/>
       </a:lt2>
       <a:accent1>
-        <a:srgbClr val="4472C4"/>
+        <a:srgbClr val="156082"/>
       </a:accent1>
       <a:accent2>
-        <a:srgbClr val="ED7D31"/>
+        <a:srgbClr val="E97132"/>
       </a:accent2>
       <a:accent3>
-        <a:srgbClr val="A5A5A5"/>
+        <a:srgbClr val="196B24"/>
       </a:accent3>
       <a:accent4>
-        <a:srgbClr val="FFC000"/>
+        <a:srgbClr val="0F9ED5"/>
       </a:accent4>
       <a:accent5>
-        <a:srgbClr val="5B9BD5"/>
+        <a:srgbClr val="A02B93"/>
       </a:accent5>
       <a:accent6>
-        <a:srgbClr val="70AD47"/>
+        <a:srgbClr val="4EA72E"/>
       </a:accent6>
       <a:hlink>
-        <a:srgbClr val="0563C1"/>
+        <a:srgbClr val="467886"/>
       </a:hlink>
       <a:folHlink>
-        <a:srgbClr val="954F72"/>
+        <a:srgbClr val="96607D"/>
       </a:folHlink>
     </a:clrScheme>
     <a:fontScheme name="Office">
       <a:majorFont>
-        <a:latin typeface="Calibri Light" panose="020F0302020204030204"/>
+        <a:latin typeface="Aptos Display" panose="02110004020202020204"/>
         <a:ea typeface=""/>
         <a:cs typeface=""/>
         <a:font script="Jpan" typeface="游ゴシック Light"/>
@@ -1593,7 +1586,7 @@
         <a:font script="Tfng" typeface="Ebrima"/>
       </a:majorFont>
       <a:minorFont>
-        <a:latin typeface="Calibri" panose="020F0502020204030204"/>
+        <a:latin typeface="Aptos" panose="02110004020202020204"/>
         <a:ea typeface=""/>
         <a:cs typeface=""/>
         <a:font script="Jpan" typeface="游明朝"/>
@@ -1704,13 +1697,6 @@
         </a:gradFill>
       </a:fillStyleLst>
       <a:lnStyleLst>
-        <a:ln w="6350" cap="flat" cmpd="sng" algn="ctr">
-          <a:solidFill>
-            <a:schemeClr val="phClr"/>
-          </a:solidFill>
-          <a:prstDash val="solid"/>
-          <a:miter lim="800000"/>
-        </a:ln>
         <a:ln w="12700" cap="flat" cmpd="sng" algn="ctr">
           <a:solidFill>
             <a:schemeClr val="phClr"/>
@@ -1719,6 +1705,13 @@
           <a:miter lim="800000"/>
         </a:ln>
         <a:ln w="19050" cap="flat" cmpd="sng" algn="ctr">
+          <a:solidFill>
+            <a:schemeClr val="phClr"/>
+          </a:solidFill>
+          <a:prstDash val="solid"/>
+          <a:miter lim="800000"/>
+        </a:ln>
+        <a:ln w="25400" cap="flat" cmpd="sng" algn="ctr">
           <a:solidFill>
             <a:schemeClr val="phClr"/>
           </a:solidFill>
@@ -1783,24 +1776,32 @@
       </a:bgFillStyleLst>
     </a:fmtScheme>
   </a:themeElements>
-  <a:objectDefaults/>
+  <a:objectDefaults>
+    <a:lnDef>
+      <a:spPr/>
+      <a:bodyPr/>
+      <a:lstStyle/>
+      <a:style>
+        <a:lnRef idx="2">
+          <a:schemeClr val="accent1"/>
+        </a:lnRef>
+        <a:fillRef idx="0">
+          <a:schemeClr val="accent1"/>
+        </a:fillRef>
+        <a:effectRef idx="1">
+          <a:schemeClr val="accent1"/>
+        </a:effectRef>
+        <a:fontRef idx="minor">
+          <a:schemeClr val="tx1"/>
+        </a:fontRef>
+      </a:style>
+    </a:lnDef>
+  </a:objectDefaults>
   <a:extraClrSchemeLst/>
   <a:extLst>
     <a:ext uri="{05A4C25C-085E-4340-85A3-A5531E510DB2}">
-      <thm15:themeFamily xmlns:thm15="http://schemas.microsoft.com/office/thememl/2012/main" name="Office Theme" id="{62F939B6-93AF-4DB8-9C6B-D6C7DFDC589F}" vid="{4A3C46E8-61CC-4603-A589-7422A47A8E4A}"/>
+      <thm15:themeFamily xmlns:thm15="http://schemas.microsoft.com/office/thememl/2012/main" name="Office Theme" id="{2E142A2C-CD16-42D6-873A-C26D2A0506FA}" vid="{1BDDFF52-6CD6-40A5-AB3C-68EB2F1E4D0A}"/>
     </a:ext>
   </a:extLst>
 </a:theme>
-</file>
-
-<file path=customXml/item1.xml><?xml version="1.0" encoding="utf-8"?>
-<b:Sources xmlns:b="http://schemas.openxmlformats.org/officeDocument/2006/bibliography" xmlns="http://schemas.openxmlformats.org/officeDocument/2006/bibliography" SelectedStyle="\APASixthEditionOfficeOnline.xsl" StyleName="APA" Version="6"/>
-</file>
-
-<file path=customXml/itemProps1.xml><?xml version="1.0" encoding="utf-8"?>
-<ds:datastoreItem xmlns:ds="http://schemas.openxmlformats.org/officeDocument/2006/customXml" ds:itemID="{A799F6C4-E684-4754-917A-7204BA7D790E}">
-  <ds:schemaRefs>
-    <ds:schemaRef ds:uri="http://schemas.openxmlformats.org/officeDocument/2006/bibliography"/>
-  </ds:schemaRefs>
-</ds:datastoreItem>
 </file>
</xml_diff>